<commit_message>
Ajout de la slide et de la section manquante 'Veille scientifique et technique' (obligatoire au cahier des charges, absente du deck), rebalance du script minute par minute (16 slides / 12 min), renumerotation
</commit_message>
<xml_diff>
--- a/presentation/guide_soutenance.docx
+++ b/presentation/guide_soutenance.docx
@@ -2202,7 +2202,7 @@
     <w:bookmarkEnd w:id="29"/>
     <w:bookmarkEnd w:id="30"/>
     <w:bookmarkEnd w:id="31"/>
-    <w:bookmarkStart w:id="40" w:name="partie-2-le-fil-de-ton-projet-en-détail"/>
+    <w:bookmarkStart w:id="41" w:name="partie-2-le-fil-de-ton-projet-en-détail"/>
     <w:p>
       <w:pPr>
         <w:pStyle w:val="Heading1"/>
@@ -2229,13 +2229,329 @@
       </w:r>
     </w:p>
     <w:bookmarkEnd w:id="32"/>
-    <w:bookmarkStart w:id="33" w:name="le-dataset-ce-quil-faut-savoir"/>
+    <w:bookmarkStart w:id="33" w:name="X954ea04f8d59a2fae3a057a0558d3de9cd47f3a"/>
     <w:p>
       <w:pPr>
         <w:pStyle w:val="Heading2"/>
       </w:pPr>
       <w:r>
-        <w:t xml:space="preserve">2.2 Le dataset — ce qu’il faut savoir</w:t>
+        <w:t xml:space="preserve">2.2 La veille scientifique — ce que dit la littérature, et pourquoi ces outils</w:t>
+      </w:r>
+    </w:p>
+    <w:p>
+      <w:pPr>
+        <w:pStyle w:val="FirstParagraph"/>
+      </w:pPr>
+      <w:r>
+        <w:t xml:space="preserve">Avant de coder, il faut situer son projet par rapport à l’existant — c’est ce qu’on</w:t>
+      </w:r>
+      <w:r>
+        <w:t xml:space="preserve"> </w:t>
+      </w:r>
+      <w:r>
+        <w:t xml:space="preserve">appelle la veille scientifique et technique (section 2 du rapport, une partie</w:t>
+      </w:r>
+      <w:r>
+        <w:t xml:space="preserve"> </w:t>
+      </w:r>
+      <w:r>
+        <w:t xml:space="preserve">obligatoire du cahier des charges).</w:t>
+      </w:r>
+    </w:p>
+    <w:p>
+      <w:pPr>
+        <w:pStyle w:val="BodyText"/>
+      </w:pPr>
+      <w:r>
+        <w:rPr>
+          <w:b/>
+          <w:bCs/>
+        </w:rPr>
+        <w:t xml:space="preserve">Ce que dit la littérature sur la prédiction de prix immobilier :</w:t>
+      </w:r>
+      <w:r>
+        <w:t xml:space="preserve"> </w:t>
+      </w:r>
+      <w:r>
+        <w:t xml:space="preserve">- Les approches historiques (régression hédonique) décomposent le prix en une</w:t>
+      </w:r>
+      <w:r>
+        <w:t xml:space="preserve"> </w:t>
+      </w:r>
+      <w:r>
+        <w:t xml:space="preserve">somme pondérée de caractéristiques — simples et interprétables, mais</w:t>
+      </w:r>
+      <w:r>
+        <w:t xml:space="preserve"> </w:t>
+      </w:r>
+      <w:r>
+        <w:t xml:space="preserve">incapables de capturer les interactions entre variables.</w:t>
+      </w:r>
+      <w:r>
+        <w:t xml:space="preserve"> </w:t>
+      </w:r>
+      <w:r>
+        <w:t xml:space="preserve">- Depuis les années 2000, les méthodes d’ensemble à base d’arbres (Random</w:t>
+      </w:r>
+      <w:r>
+        <w:t xml:space="preserve"> </w:t>
+      </w:r>
+      <w:r>
+        <w:t xml:space="preserve">Forest — Breiman, 2001 ; XGBoost — Chen &amp; Guestrin, 2016) se sont imposées</w:t>
+      </w:r>
+      <w:r>
+        <w:t xml:space="preserve"> </w:t>
+      </w:r>
+      <w:r>
+        <w:t xml:space="preserve">comme état de l’art sur les données tabulaires, car elles gèrent nativement</w:t>
+      </w:r>
+      <w:r>
+        <w:t xml:space="preserve"> </w:t>
+      </w:r>
+      <w:r>
+        <w:t xml:space="preserve">les non-linéarités et interactions.</w:t>
+      </w:r>
+      <w:r>
+        <w:t xml:space="preserve"> </w:t>
+      </w:r>
+      <w:r>
+        <w:t xml:space="preserve">- Sur ce même dataset spécifiquement, les travaux publiés rapportent</w:t>
+      </w:r>
+      <w:r>
+        <w:t xml:space="preserve"> </w:t>
+      </w:r>
+      <w:r>
+        <w:t xml:space="preserve">généralement un R² entre 0,5 et 0,65 lorsqu’on n’utilise pas les avis</w:t>
+      </w:r>
+      <w:r>
+        <w:t xml:space="preserve"> </w:t>
+      </w:r>
+      <w:r>
+        <w:t xml:space="preserve">textuels ni les photos — une limite structurelle que ton propre résultat</w:t>
+      </w:r>
+      <w:r>
+        <w:t xml:space="preserve"> </w:t>
+      </w:r>
+      <w:r>
+        <w:t xml:space="preserve">(R² = 0,45) confirme et respecte.</w:t>
+      </w:r>
+    </w:p>
+    <w:p>
+      <w:pPr>
+        <w:pStyle w:val="BodyText"/>
+      </w:pPr>
+      <w:r>
+        <w:rPr>
+          <w:b/>
+          <w:bCs/>
+        </w:rPr>
+        <w:t xml:space="preserve">Le benchmark des outils</w:t>
+      </w:r>
+      <w:r>
+        <w:t xml:space="preserve"> </w:t>
+      </w:r>
+      <w:r>
+        <w:t xml:space="preserve">— pour chaque brique technique, plusieurs options</w:t>
+      </w:r>
+      <w:r>
+        <w:t xml:space="preserve"> </w:t>
+      </w:r>
+      <w:r>
+        <w:t xml:space="preserve">ont été comparées avant de choisir (détail dans le rapport, section 2.2) :</w:t>
+      </w:r>
+      <w:r>
+        <w:t xml:space="preserve"> </w:t>
+      </w:r>
+      <w:r>
+        <w:t xml:space="preserve">-</w:t>
+      </w:r>
+      <w:r>
+        <w:t xml:space="preserve"> </w:t>
+      </w:r>
+      <w:r>
+        <w:rPr>
+          <w:b/>
+          <w:bCs/>
+        </w:rPr>
+        <w:t xml:space="preserve">Machine Learning</w:t>
+      </w:r>
+      <w:r>
+        <w:t xml:space="preserve"> </w:t>
+      </w:r>
+      <w:r>
+        <w:t xml:space="preserve">: scikit-learn (retenu, écosystème mature) vs</w:t>
+      </w:r>
+      <w:r>
+        <w:t xml:space="preserve"> </w:t>
+      </w:r>
+      <w:r>
+        <w:t xml:space="preserve">TensorFlow/PyTorch (écarté, surdimensionné pour un problème de régression</w:t>
+      </w:r>
+      <w:r>
+        <w:t xml:space="preserve"> </w:t>
+      </w:r>
+      <w:r>
+        <w:t xml:space="preserve">tabulaire de cette taille).</w:t>
+      </w:r>
+      <w:r>
+        <w:t xml:space="preserve"> </w:t>
+      </w:r>
+      <w:r>
+        <w:t xml:space="preserve">-</w:t>
+      </w:r>
+      <w:r>
+        <w:t xml:space="preserve"> </w:t>
+      </w:r>
+      <w:r>
+        <w:rPr>
+          <w:b/>
+          <w:bCs/>
+        </w:rPr>
+        <w:t xml:space="preserve">Interface graphique</w:t>
+      </w:r>
+      <w:r>
+        <w:t xml:space="preserve"> </w:t>
+      </w:r>
+      <w:r>
+        <w:t xml:space="preserve">: Streamlit (retenu, développement rapide en pur</w:t>
+      </w:r>
+      <w:r>
+        <w:t xml:space="preserve"> </w:t>
+      </w:r>
+      <w:r>
+        <w:t xml:space="preserve">Python) vs Dash (plus flexible mais plus long à mettre en place) vs</w:t>
+      </w:r>
+      <w:r>
+        <w:t xml:space="preserve"> </w:t>
+      </w:r>
+      <w:r>
+        <w:t xml:space="preserve">application web classique React + API (beaucoup trop long pour le temps</w:t>
+      </w:r>
+      <w:r>
+        <w:t xml:space="preserve"> </w:t>
+      </w:r>
+      <w:r>
+        <w:t xml:space="preserve">imparti).</w:t>
+      </w:r>
+      <w:r>
+        <w:t xml:space="preserve"> </w:t>
+      </w:r>
+      <w:r>
+        <w:t xml:space="preserve">-</w:t>
+      </w:r>
+      <w:r>
+        <w:t xml:space="preserve"> </w:t>
+      </w:r>
+      <w:r>
+        <w:rPr>
+          <w:b/>
+          <w:bCs/>
+        </w:rPr>
+        <w:t xml:space="preserve">Cartographie</w:t>
+      </w:r>
+      <w:r>
+        <w:t xml:space="preserve"> </w:t>
+      </w:r>
+      <w:r>
+        <w:t xml:space="preserve">: Plotly (retenu pour l’affichage, cartes interactives</w:t>
+      </w:r>
+      <w:r>
+        <w:t xml:space="preserve"> </w:t>
+      </w:r>
+      <w:r>
+        <w:t xml:space="preserve">simples) et Folium (retenu spécifiquement pour l’onglet Test, car c’est la</w:t>
+      </w:r>
+      <w:r>
+        <w:t xml:space="preserve"> </w:t>
+      </w:r>
+      <w:r>
+        <w:t xml:space="preserve">seule librairie testée qui permette de récupérer les coordonnées d’un clic</w:t>
+      </w:r>
+      <w:r>
+        <w:t xml:space="preserve"> </w:t>
+      </w:r>
+      <w:r>
+        <w:t xml:space="preserve">utilisateur dans Streamlit).</w:t>
+      </w:r>
+    </w:p>
+    <w:p>
+      <w:pPr>
+        <w:pStyle w:val="BodyText"/>
+      </w:pPr>
+      <w:r>
+        <w:rPr>
+          <w:b/>
+          <w:bCs/>
+        </w:rPr>
+        <w:t xml:space="preserve">Phrase à retenir pour l’oral</w:t>
+      </w:r>
+      <w:r>
+        <w:t xml:space="preserve"> </w:t>
+      </w:r>
+      <w:r>
+        <w:t xml:space="preserve">:</w:t>
+      </w:r>
+      <w:r>
+        <w:t xml:space="preserve"> </w:t>
+      </w:r>
+      <w:r>
+        <w:rPr>
+          <w:i/>
+          <w:iCs/>
+        </w:rPr>
+        <w:t xml:space="preserve">“Je ne suis pas partie de zéro : la</w:t>
+      </w:r>
+      <w:r>
+        <w:rPr>
+          <w:i/>
+          <w:iCs/>
+        </w:rPr>
+        <w:t xml:space="preserve"> </w:t>
+      </w:r>
+      <w:r>
+        <w:rPr>
+          <w:i/>
+          <w:iCs/>
+        </w:rPr>
+        <w:t xml:space="preserve">littérature confirme que les méthodes à base d’arbres dominent sur ce type de</w:t>
+      </w:r>
+      <w:r>
+        <w:rPr>
+          <w:i/>
+          <w:iCs/>
+        </w:rPr>
+        <w:t xml:space="preserve"> </w:t>
+      </w:r>
+      <w:r>
+        <w:rPr>
+          <w:i/>
+          <w:iCs/>
+        </w:rPr>
+        <w:t xml:space="preserve">données, et mon benchmark de 12 modèles retrouve exactement cette hiérarchie</w:t>
+      </w:r>
+      <w:r>
+        <w:rPr>
+          <w:i/>
+          <w:iCs/>
+        </w:rPr>
+        <w:t xml:space="preserve"> </w:t>
+      </w:r>
+      <w:r>
+        <w:rPr>
+          <w:i/>
+          <w:iCs/>
+        </w:rPr>
+        <w:t xml:space="preserve">— ce qui valide à la fois mon protocole et les résultats de la littérature.”</w:t>
+      </w:r>
+    </w:p>
+    <w:bookmarkEnd w:id="33"/>
+    <w:bookmarkStart w:id="34" w:name="le-dataset-ce-quil-faut-savoir"/>
+    <w:p>
+      <w:pPr>
+        <w:pStyle w:val="Heading2"/>
+      </w:pPr>
+      <w:r>
+        <w:t xml:space="preserve">2.3 Le dataset — ce qu’il faut savoir</w:t>
       </w:r>
     </w:p>
     <w:p>
@@ -2327,14 +2643,14 @@
         <w:t xml:space="preserve">C’est important à dire toi-même au jury avant qu’on te le reproche : ça explique pourquoi le modèle ne peut pas tout deviner parfaitement.</w:t>
       </w:r>
     </w:p>
-    <w:bookmarkEnd w:id="33"/>
-    <w:bookmarkStart w:id="34" w:name="le-nettoyage-des-données-prétraitement"/>
+    <w:bookmarkEnd w:id="34"/>
+    <w:bookmarkStart w:id="35" w:name="le-nettoyage-des-données-prétraitement"/>
     <w:p>
       <w:pPr>
         <w:pStyle w:val="Heading2"/>
       </w:pPr>
       <w:r>
-        <w:t xml:space="preserve">2.3 Le nettoyage des données (prétraitement)</w:t>
+        <w:t xml:space="preserve">2.4 Le nettoyage des données (prétraitement)</w:t>
       </w:r>
     </w:p>
     <w:p>
@@ -2668,14 +2984,14 @@
         <w:t xml:space="preserve">: la proportion d’annonces qui se trouvent dans ce quartier par rapport à toutes les annonces. Un quartier très demandé aura une fréquence plus élevée qu’un quartier rare.</w:t>
       </w:r>
     </w:p>
-    <w:bookmarkEnd w:id="34"/>
-    <w:bookmarkStart w:id="35" w:name="Xc8f55899aaf5c9aefd89b52c2dd42ed63907352"/>
+    <w:bookmarkEnd w:id="35"/>
+    <w:bookmarkStart w:id="36" w:name="Xc8f55899aaf5c9aefd89b52c2dd42ed63907352"/>
     <w:p>
       <w:pPr>
         <w:pStyle w:val="Heading2"/>
       </w:pPr>
       <w:r>
-        <w:t xml:space="preserve">2.4 L’analyse exploratoire — comprendre avant de modéliser</w:t>
+        <w:t xml:space="preserve">2.5 L’analyse exploratoire — comprendre avant de modéliser</w:t>
       </w:r>
     </w:p>
     <w:p>
@@ -3336,14 +3652,14 @@
         <w:t xml:space="preserve">a la corrélation la plus forte avec le prix parmi les variables numériques (-0,31 : plus on s’éloigne du centre, moins c’est cher en moyenne), mais cette corrélation reste modérée — ça annonce déjà que le modèle ne pourra pas tout expliquer avec les variables disponibles.</w:t>
       </w:r>
     </w:p>
-    <w:bookmarkEnd w:id="35"/>
-    <w:bookmarkStart w:id="36" w:name="comparer-12-modèles-le-cœur-du-projet"/>
+    <w:bookmarkEnd w:id="36"/>
+    <w:bookmarkStart w:id="37" w:name="comparer-12-modèles-le-cœur-du-projet"/>
     <w:p>
       <w:pPr>
         <w:pStyle w:val="Heading2"/>
       </w:pPr>
       <w:r>
-        <w:t xml:space="preserve">2.5 Comparer 12 modèles — le cœur du projet</w:t>
+        <w:t xml:space="preserve">2.6 Comparer 12 modèles — le cœur du projet</w:t>
       </w:r>
     </w:p>
     <w:p>
@@ -3996,14 +4312,14 @@
         <w:t xml:space="preserve">: par exemple, être loin du centre ne fait pas baisser le prix de la même façon selon que le logement est entier ou une simple chambre. Les modèles à base d’arbres peuvent capturer ce genre de nuance ; les modèles linéaires, non.</w:t>
       </w:r>
     </w:p>
-    <w:bookmarkEnd w:id="36"/>
-    <w:bookmarkStart w:id="37" w:name="optimiser-les-3-meilleurs-modèles"/>
+    <w:bookmarkEnd w:id="37"/>
+    <w:bookmarkStart w:id="38" w:name="optimiser-les-3-meilleurs-modèles"/>
     <w:p>
       <w:pPr>
         <w:pStyle w:val="Heading2"/>
       </w:pPr>
       <w:r>
-        <w:t xml:space="preserve">2.6 Optimiser les 3 meilleurs modèles</w:t>
+        <w:t xml:space="preserve">2.7 Optimiser les 3 meilleurs modèles</w:t>
       </w:r>
     </w:p>
     <w:p>
@@ -4177,14 +4493,14 @@
         <w:t xml:space="preserve">: les réglages par défaut des librairies sont déjà bien pensés. Le vrai gain de performance vient du choix de la famille d’algorithme (arbres plutôt que linéaire), pas du réglage fin.</w:t>
       </w:r>
     </w:p>
-    <w:bookmarkEnd w:id="37"/>
-    <w:bookmarkStart w:id="38" w:name="X2efa4dc16a47ece54b185d189089bedb257c43f"/>
+    <w:bookmarkEnd w:id="38"/>
+    <w:bookmarkStart w:id="39" w:name="X2efa4dc16a47ece54b185d189089bedb257c43f"/>
     <w:p>
       <w:pPr>
         <w:pStyle w:val="Heading2"/>
       </w:pPr>
       <w:r>
-        <w:t xml:space="preserve">2.7 L’importance des variables — qu’est-ce qui influence vraiment le prix ?</w:t>
+        <w:t xml:space="preserve">2.8 L’importance des variables — qu’est-ce qui influence vraiment le prix ?</w:t>
       </w:r>
     </w:p>
     <w:p>
@@ -4293,14 +4609,14 @@
         <w:t xml:space="preserve">: le type de logement compte beaucoup plus que l’endroit où il se trouve dans Manhattan/Brooklyn/etc. Un logement entier vaut nettement plus cher, où qu’il soit, alors que la localisation ne fait varier le prix qu’à la marge en comparaison.</w:t>
       </w:r>
     </w:p>
-    <w:bookmarkEnd w:id="38"/>
-    <w:bookmarkStart w:id="39" w:name="lapplication-linterface-graphique"/>
+    <w:bookmarkEnd w:id="39"/>
+    <w:bookmarkStart w:id="40" w:name="lapplication-linterface-graphique"/>
     <w:p>
       <w:pPr>
         <w:pStyle w:val="Heading2"/>
       </w:pPr>
       <w:r>
-        <w:t xml:space="preserve">2.8 L’application (l’interface graphique)</w:t>
+        <w:t xml:space="preserve">2.9 L’application (l’interface graphique)</w:t>
       </w:r>
     </w:p>
     <w:p>
@@ -4445,9 +4761,9 @@
         </w:pict>
       </w:r>
     </w:p>
-    <w:bookmarkEnd w:id="39"/>
     <w:bookmarkEnd w:id="40"/>
-    <w:bookmarkStart w:id="41" w:name="X6d6ac9b806ddb3e2fb7f0a6500c1f58095b8dfc"/>
+    <w:bookmarkEnd w:id="41"/>
+    <w:bookmarkStart w:id="42" w:name="X6d6ac9b806ddb3e2fb7f0a6500c1f58095b8dfc"/>
     <w:p>
       <w:pPr>
         <w:pStyle w:val="Heading1"/>
@@ -4814,8 +5130,8 @@
         </w:pict>
       </w:r>
     </w:p>
-    <w:bookmarkEnd w:id="41"/>
-    <w:bookmarkStart w:id="42" w:name="Xff1f7298281542db84d29eb41e8db701eb316c0"/>
+    <w:bookmarkEnd w:id="42"/>
+    <w:bookmarkStart w:id="43" w:name="Xff1f7298281542db84d29eb41e8db701eb316c0"/>
     <w:p>
       <w:pPr>
         <w:pStyle w:val="Heading1"/>
@@ -4829,23 +5145,64 @@
         <w:pStyle w:val="FirstParagraph"/>
       </w:pPr>
       <w:r>
-        <w:t xml:space="preserve">Avec 15 slides en 12 minutes, tu as en moyenne</w:t>
-      </w:r>
-      <w:r>
-        <w:t xml:space="preserve"> </w:t>
-      </w:r>
-      <w:r>
-        <w:rPr>
-          <w:b/>
-          <w:bCs/>
-        </w:rPr>
-        <w:t xml:space="preserve">48 secondes par slide</w:t>
-      </w:r>
-      <w:r>
-        <w:t xml:space="preserve"> </w:t>
-      </w:r>
-      <w:r>
-        <w:t xml:space="preserve">— c’est très rapide. Voici une répartition réaliste qui priorise les slides les plus importantes. Adapte les phrases avec tes propres mots, ne les récite pas mot à mot.</w:t>
+        <w:t xml:space="preserve">Le deck fait maintenant</w:t>
+      </w:r>
+      <w:r>
+        <w:t xml:space="preserve"> </w:t>
+      </w:r>
+      <w:r>
+        <w:rPr>
+          <w:b/>
+          <w:bCs/>
+        </w:rPr>
+        <w:t xml:space="preserve">16 slides</w:t>
+      </w:r>
+      <w:r>
+        <w:t xml:space="preserve"> </w:t>
+      </w:r>
+      <w:r>
+        <w:t xml:space="preserve">(une slide</w:t>
+      </w:r>
+      <w:r>
+        <w:t xml:space="preserve"> </w:t>
+      </w:r>
+      <w:r>
+        <w:t xml:space="preserve">“Veille scientifique et technique”</w:t>
+      </w:r>
+      <w:r>
+        <w:t xml:space="preserve"> </w:t>
+      </w:r>
+      <w:r>
+        <w:t xml:space="preserve">a été ajoutée — elle correspond à la section 2 du rapport, obligatoire dans le cahier des charges, et manquait à l’oral). Avec 16 slides en 12 minutes, tu as en moyenne</w:t>
+      </w:r>
+      <w:r>
+        <w:t xml:space="preserve"> </w:t>
+      </w:r>
+      <w:r>
+        <w:rPr>
+          <w:b/>
+          <w:bCs/>
+        </w:rPr>
+        <w:t xml:space="preserve">45 secondes par slide</w:t>
+      </w:r>
+      <w:r>
+        <w:t xml:space="preserve"> </w:t>
+      </w:r>
+      <w:r>
+        <w:t xml:space="preserve">— c’est rapide, donc va à l’essentiel à l’oral et garde le détail pour les questions. Le tableau ci-dessous totalise</w:t>
+      </w:r>
+      <w:r>
+        <w:t xml:space="preserve"> </w:t>
+      </w:r>
+      <w:r>
+        <w:rPr>
+          <w:b/>
+          <w:bCs/>
+        </w:rPr>
+        <w:t xml:space="preserve">11 min 20</w:t>
+      </w:r>
+      <w:r>
+        <w:t xml:space="preserve">, ce qui te laisse volontairement une quarantaine de secondes de marge (transitions, hésitations, une question posée en cours de route). Adapte les phrases avec tes propres mots, ne les récite pas mot à mot.</w:t>
       </w:r>
     </w:p>
     <w:tbl>
@@ -4906,7 +5263,7 @@
               <w:pStyle w:val="Compact"/>
             </w:pPr>
             <w:r>
-              <w:t xml:space="preserve">0:00-0:40</w:t>
+              <w:t xml:space="preserve">0:00-0:35</w:t>
             </w:r>
           </w:p>
         </w:tc>
@@ -4941,7 +5298,7 @@
               <w:pStyle w:val="Compact"/>
             </w:pPr>
             <w:r>
-              <w:t xml:space="preserve">0:40-1:10</w:t>
+              <w:t xml:space="preserve">0:35-1:00</w:t>
             </w:r>
           </w:p>
         </w:tc>
@@ -4969,7 +5326,7 @@
               <w:t xml:space="preserve"> </w:t>
             </w:r>
             <w:r>
-              <w:t xml:space="preserve">“je vais présenter le contexte, les données, ma méthode, mes résultats, et les limites.”</w:t>
+              <w:t xml:space="preserve">“je vais présenter le contexte, la veille scientifique, les données, ma méthode, mes résultats, et les limites.”</w:t>
             </w:r>
           </w:p>
         </w:tc>
@@ -4982,50 +5339,29 @@
               <w:pStyle w:val="Compact"/>
             </w:pPr>
             <w:r>
-              <w:t xml:space="preserve">1:10-2:10</w:t>
-            </w:r>
-          </w:p>
-        </w:tc>
-        <w:tc>
-          <w:tcPr/>
-          <w:p>
-            <w:pPr>
-              <w:pStyle w:val="Compact"/>
-            </w:pPr>
-            <w:r>
-              <w:t xml:space="preserve">3-4. Contexte, problématique, objectifs</w:t>
-            </w:r>
-          </w:p>
-        </w:tc>
-        <w:tc>
-          <w:tcPr/>
-          <w:p>
-            <w:pPr>
-              <w:pStyle w:val="Compact"/>
-            </w:pPr>
-            <w:r>
-              <w:t xml:space="preserve">Le problème (fixer un prix sans référence objective) et tes 5 objectifs. Va vite sur la liste, insiste sur</w:t>
-            </w:r>
-            <w:r>
-              <w:t xml:space="preserve"> </w:t>
-            </w:r>
-            <w:r>
-              <w:t xml:space="preserve">“comparer au moins 10 modèles”</w:t>
-            </w:r>
-            <w:r>
-              <w:t xml:space="preserve"> </w:t>
-            </w:r>
-            <w:r>
-              <w:t xml:space="preserve">et</w:t>
-            </w:r>
-            <w:r>
-              <w:t xml:space="preserve"> </w:t>
-            </w:r>
-            <w:r>
-              <w:t xml:space="preserve">“interface graphique”</w:t>
-            </w:r>
-            <w:r>
-              <w:t xml:space="preserve">.</w:t>
+              <w:t xml:space="preserve">1:00-1:45</w:t>
+            </w:r>
+          </w:p>
+        </w:tc>
+        <w:tc>
+          <w:tcPr/>
+          <w:p>
+            <w:pPr>
+              <w:pStyle w:val="Compact"/>
+            </w:pPr>
+            <w:r>
+              <w:t xml:space="preserve">3. Contexte et problématique</w:t>
+            </w:r>
+          </w:p>
+        </w:tc>
+        <w:tc>
+          <w:tcPr/>
+          <w:p>
+            <w:pPr>
+              <w:pStyle w:val="Compact"/>
+            </w:pPr>
+            <w:r>
+              <w:t xml:space="preserve">Le problème : un hôte fixe son prix sans référence objective. Question centrale : peut-on prédire le prix à partir des seules caractéristiques structurelles ?</w:t>
             </w:r>
           </w:p>
         </w:tc>
@@ -5038,35 +5374,59 @@
               <w:pStyle w:val="Compact"/>
             </w:pPr>
             <w:r>
-              <w:t xml:space="preserve">2:10-2:50</w:t>
-            </w:r>
-          </w:p>
-        </w:tc>
-        <w:tc>
-          <w:tcPr/>
-          <w:p>
-            <w:pPr>
-              <w:pStyle w:val="Compact"/>
-            </w:pPr>
-            <w:r>
-              <w:t xml:space="preserve">5. Dataset</w:t>
-            </w:r>
-          </w:p>
-        </w:tc>
-        <w:tc>
-          <w:tcPr/>
-          <w:p>
-            <w:pPr>
-              <w:pStyle w:val="Compact"/>
-            </w:pPr>
-            <w:r>
-              <w:t xml:space="preserve">Donne juste les chiffres clés : 48 895 annonces, 16 variables, 5 arrondissements, 221 quartiers. Précise à l’oral :</w:t>
+              <w:t xml:space="preserve">1:45-2:20</w:t>
+            </w:r>
+          </w:p>
+        </w:tc>
+        <w:tc>
+          <w:tcPr/>
+          <w:p>
+            <w:pPr>
+              <w:pStyle w:val="Compact"/>
+            </w:pPr>
+            <w:r>
+              <w:t xml:space="preserve">4. Objectifs</w:t>
+            </w:r>
+          </w:p>
+        </w:tc>
+        <w:tc>
+          <w:tcPr/>
+          <w:p>
+            <w:pPr>
+              <w:pStyle w:val="Compact"/>
+            </w:pPr>
+            <w:r>
+              <w:t xml:space="preserve">Va vite sur la liste des 5 objectifs, insiste sur</w:t>
             </w:r>
             <w:r>
               <w:t xml:space="preserve"> </w:t>
             </w:r>
             <w:r>
-              <w:t xml:space="preserve">“pas de photos ni de texte, ce qui limite la précision atteignable — j’y reviendrai.”</w:t>
+              <w:t xml:space="preserve">“comparer au moins 10 modèles”</w:t>
+            </w:r>
+            <w:r>
+              <w:t xml:space="preserve">,</w:t>
+            </w:r>
+            <w:r>
+              <w:t xml:space="preserve"> </w:t>
+            </w:r>
+            <w:r>
+              <w:t xml:space="preserve">“au moins 4 métriques”</w:t>
+            </w:r>
+            <w:r>
+              <w:t xml:space="preserve"> </w:t>
+            </w:r>
+            <w:r>
+              <w:t xml:space="preserve">et</w:t>
+            </w:r>
+            <w:r>
+              <w:t xml:space="preserve"> </w:t>
+            </w:r>
+            <w:r>
+              <w:t xml:space="preserve">“interface graphique”</w:t>
+            </w:r>
+            <w:r>
+              <w:t xml:space="preserve">.</w:t>
             </w:r>
           </w:p>
         </w:tc>
@@ -5079,29 +5439,35 @@
               <w:pStyle w:val="Compact"/>
             </w:pPr>
             <w:r>
-              <w:t xml:space="preserve">2:50-3:50</w:t>
-            </w:r>
-          </w:p>
-        </w:tc>
-        <w:tc>
-          <w:tcPr/>
-          <w:p>
-            <w:pPr>
-              <w:pStyle w:val="Compact"/>
-            </w:pPr>
-            <w:r>
-              <w:t xml:space="preserve">6. Analyse exploratoire</w:t>
-            </w:r>
-          </w:p>
-        </w:tc>
-        <w:tc>
-          <w:tcPr/>
-          <w:p>
-            <w:pPr>
-              <w:pStyle w:val="Compact"/>
-            </w:pPr>
-            <w:r>
-              <w:t xml:space="preserve">Montre les 2 graphiques, dis les deux constats clés (Manhattan &gt;&gt; Bronx, logement entier x2-3 plus cher que chambre).</w:t>
+              <w:t xml:space="preserve">2:20-2:55</w:t>
+            </w:r>
+          </w:p>
+        </w:tc>
+        <w:tc>
+          <w:tcPr/>
+          <w:p>
+            <w:pPr>
+              <w:pStyle w:val="Compact"/>
+            </w:pPr>
+            <w:r>
+              <w:t xml:space="preserve">5. Veille scientifique et technique</w:t>
+            </w:r>
+          </w:p>
+        </w:tc>
+        <w:tc>
+          <w:tcPr/>
+          <w:p>
+            <w:pPr>
+              <w:pStyle w:val="Compact"/>
+            </w:pPr>
+            <w:r>
+              <w:t xml:space="preserve">En une phrase :</w:t>
+            </w:r>
+            <w:r>
+              <w:t xml:space="preserve"> </w:t>
+            </w:r>
+            <w:r>
+              <w:t xml:space="preserve">“la littérature montre que les méthodes à base d’arbres (Random Forest, XGBoost) dominent sur ce type de données, avec un R² qui plafonne entre 0,5 et 0,65 sans texte ni photos — ça confirme ce que j’ai retrouvé. J’ai choisi scikit-learn et XGBoost pour le Machine Learning, Streamlit pour l’interface, et Folium spécifiquement parce que c’est la seule librairie qui permet de capter un clic utilisateur sur la carte.”</w:t>
             </w:r>
           </w:p>
         </w:tc>
@@ -5114,29 +5480,35 @@
               <w:pStyle w:val="Compact"/>
             </w:pPr>
             <w:r>
-              <w:t xml:space="preserve">3:50-4:50</w:t>
-            </w:r>
-          </w:p>
-        </w:tc>
-        <w:tc>
-          <w:tcPr/>
-          <w:p>
-            <w:pPr>
-              <w:pStyle w:val="Compact"/>
-            </w:pPr>
-            <w:r>
-              <w:t xml:space="preserve">7. Prétraitement</w:t>
-            </w:r>
-          </w:p>
-        </w:tc>
-        <w:tc>
-          <w:tcPr/>
-          <w:p>
-            <w:pPr>
-              <w:pStyle w:val="Compact"/>
-            </w:pPr>
-            <w:r>
-              <w:t xml:space="preserve">Explique en 1 phrase chaque point : valeurs aberrantes retirées (1%), distance au centre calculée, encodage par fréquence pour les 221 quartiers. Pas besoin de détailler haversine à l’oral, garde ça pour une question.</w:t>
+              <w:t xml:space="preserve">2:55-3:25</w:t>
+            </w:r>
+          </w:p>
+        </w:tc>
+        <w:tc>
+          <w:tcPr/>
+          <w:p>
+            <w:pPr>
+              <w:pStyle w:val="Compact"/>
+            </w:pPr>
+            <w:r>
+              <w:t xml:space="preserve">6. Dataset</w:t>
+            </w:r>
+          </w:p>
+        </w:tc>
+        <w:tc>
+          <w:tcPr/>
+          <w:p>
+            <w:pPr>
+              <w:pStyle w:val="Compact"/>
+            </w:pPr>
+            <w:r>
+              <w:t xml:space="preserve">Donne juste les chiffres clés : 48 895 annonces, 16 variables, 5 arrondissements, 221 quartiers. Précise à l’oral :</w:t>
+            </w:r>
+            <w:r>
+              <w:t xml:space="preserve"> </w:t>
+            </w:r>
+            <w:r>
+              <w:t xml:space="preserve">“pas de photos ni de texte, ce qui limite la précision atteignable — j’y reviendrai.”</w:t>
             </w:r>
           </w:p>
         </w:tc>
@@ -5149,38 +5521,29 @@
               <w:pStyle w:val="Compact"/>
             </w:pPr>
             <w:r>
-              <w:t xml:space="preserve">4:50-5:30</w:t>
-            </w:r>
-          </w:p>
-        </w:tc>
-        <w:tc>
-          <w:tcPr/>
-          <w:p>
-            <w:pPr>
-              <w:pStyle w:val="Compact"/>
-            </w:pPr>
-            <w:r>
-              <w:t xml:space="preserve">8. Architecture</w:t>
-            </w:r>
-          </w:p>
-        </w:tc>
-        <w:tc>
-          <w:tcPr/>
-          <w:p>
-            <w:pPr>
-              <w:pStyle w:val="Compact"/>
-            </w:pPr>
-            <w:r>
-              <w:t xml:space="preserve">Montre le schéma, dis juste</w:t>
-            </w:r>
-            <w:r>
-              <w:t xml:space="preserve"> </w:t>
-            </w:r>
-            <w:r>
-              <w:t xml:space="preserve">“voici le pipeline : données brutes, nettoyage, comparaison de modèles, application”</w:t>
-            </w:r>
-            <w:r>
-              <w:t xml:space="preserve">.</w:t>
+              <w:t xml:space="preserve">3:25-4:15</w:t>
+            </w:r>
+          </w:p>
+        </w:tc>
+        <w:tc>
+          <w:tcPr/>
+          <w:p>
+            <w:pPr>
+              <w:pStyle w:val="Compact"/>
+            </w:pPr>
+            <w:r>
+              <w:t xml:space="preserve">7. Analyse exploratoire</w:t>
+            </w:r>
+          </w:p>
+        </w:tc>
+        <w:tc>
+          <w:tcPr/>
+          <w:p>
+            <w:pPr>
+              <w:pStyle w:val="Compact"/>
+            </w:pPr>
+            <w:r>
+              <w:t xml:space="preserve">Montre les 2 graphiques, dis les deux constats clés (Manhattan &gt;&gt; Bronx, logement entier x2-3 plus cher que chambre).</w:t>
             </w:r>
           </w:p>
         </w:tc>
@@ -5193,41 +5556,29 @@
               <w:pStyle w:val="Compact"/>
             </w:pPr>
             <w:r>
-              <w:t xml:space="preserve">5:30-6:45</w:t>
-            </w:r>
-          </w:p>
-        </w:tc>
-        <w:tc>
-          <w:tcPr/>
-          <w:p>
-            <w:pPr>
-              <w:pStyle w:val="Compact"/>
-            </w:pPr>
-            <w:r>
-              <w:t xml:space="preserve">9. Comparaison des 12 modèles</w:t>
-            </w:r>
-          </w:p>
-        </w:tc>
-        <w:tc>
-          <w:tcPr/>
-          <w:p>
-            <w:pPr>
-              <w:pStyle w:val="Compact"/>
-            </w:pPr>
-            <w:r>
-              <w:t xml:space="preserve">LA slide la plus importante. Dis :</w:t>
-            </w:r>
-            <w:r>
-              <w:t xml:space="preserve"> </w:t>
-            </w:r>
-            <w:r>
-              <w:t xml:space="preserve">“j’ai testé 12 algorithmes avec un protocole identique. Les 3 meilleurs sont tous des méthodes à base d’arbres combinés (les 3 barres coral), loin devant les modèles linéaires (à droite).”</w:t>
-            </w:r>
-            <w:r>
-              <w:t xml:space="preserve"> </w:t>
-            </w:r>
-            <w:r>
-              <w:t xml:space="preserve">Explique en 1 phrase pourquoi (interactions non-linéaires, section 2.5).</w:t>
+              <w:t xml:space="preserve">4:15-5:00</w:t>
+            </w:r>
+          </w:p>
+        </w:tc>
+        <w:tc>
+          <w:tcPr/>
+          <w:p>
+            <w:pPr>
+              <w:pStyle w:val="Compact"/>
+            </w:pPr>
+            <w:r>
+              <w:t xml:space="preserve">8. Prétraitement</w:t>
+            </w:r>
+          </w:p>
+        </w:tc>
+        <w:tc>
+          <w:tcPr/>
+          <w:p>
+            <w:pPr>
+              <w:pStyle w:val="Compact"/>
+            </w:pPr>
+            <w:r>
+              <w:t xml:space="preserve">Explique en 1 phrase chaque point : valeurs aberrantes retirées (1%), distance au centre calculée, encodage par fréquence pour les 221 quartiers. Pas besoin de détailler haversine à l’oral, garde ça pour une question.</w:t>
             </w:r>
           </w:p>
         </w:tc>
@@ -5240,41 +5591,38 @@
               <w:pStyle w:val="Compact"/>
             </w:pPr>
             <w:r>
-              <w:t xml:space="preserve">6:45-7:45</w:t>
-            </w:r>
-          </w:p>
-        </w:tc>
-        <w:tc>
-          <w:tcPr/>
-          <w:p>
-            <w:pPr>
-              <w:pStyle w:val="Compact"/>
-            </w:pPr>
-            <w:r>
-              <w:t xml:space="preserve">10. Modèle final XGBoost</w:t>
-            </w:r>
-          </w:p>
-        </w:tc>
-        <w:tc>
-          <w:tcPr/>
-          <w:p>
-            <w:pPr>
-              <w:pStyle w:val="Compact"/>
-            </w:pPr>
-            <w:r>
-              <w:t xml:space="preserve">Donne les 4 métriques en les traduisant :</w:t>
+              <w:t xml:space="preserve">5:00-5:25</w:t>
+            </w:r>
+          </w:p>
+        </w:tc>
+        <w:tc>
+          <w:tcPr/>
+          <w:p>
+            <w:pPr>
+              <w:pStyle w:val="Compact"/>
+            </w:pPr>
+            <w:r>
+              <w:t xml:space="preserve">9. Architecture</w:t>
+            </w:r>
+          </w:p>
+        </w:tc>
+        <w:tc>
+          <w:tcPr/>
+          <w:p>
+            <w:pPr>
+              <w:pStyle w:val="Compact"/>
+            </w:pPr>
+            <w:r>
+              <w:t xml:space="preserve">Montre le schéma, dis juste</w:t>
             </w:r>
             <w:r>
               <w:t xml:space="preserve"> </w:t>
             </w:r>
             <w:r>
-              <w:t xml:space="preserve">“mon modèle se trompe en moyenne de 48$ par nuit, et explique 45% de la variation du prix.”</w:t>
-            </w:r>
-            <w:r>
-              <w:t xml:space="preserve"> </w:t>
-            </w:r>
-            <w:r>
-              <w:t xml:space="preserve">Mentionne le résultat de feature importance (logement entier = 59% du poids).</w:t>
+              <w:t xml:space="preserve">“voici le pipeline : données brutes, nettoyage, comparaison de modèles, application”</w:t>
+            </w:r>
+            <w:r>
+              <w:t xml:space="preserve">.</w:t>
             </w:r>
           </w:p>
         </w:tc>
@@ -5287,35 +5635,41 @@
               <w:pStyle w:val="Compact"/>
             </w:pPr>
             <w:r>
-              <w:t xml:space="preserve">7:45-8:30</w:t>
-            </w:r>
-          </w:p>
-        </w:tc>
-        <w:tc>
-          <w:tcPr/>
-          <w:p>
-            <w:pPr>
-              <w:pStyle w:val="Compact"/>
-            </w:pPr>
-            <w:r>
-              <w:t xml:space="preserve">11. Analyse critique</w:t>
-            </w:r>
-          </w:p>
-        </w:tc>
-        <w:tc>
-          <w:tcPr/>
-          <w:p>
-            <w:pPr>
-              <w:pStyle w:val="Compact"/>
-            </w:pPr>
-            <w:r>
-              <w:t xml:space="preserve">Dis les points forts vite, puis ATTARDE-toi sur les limites — ça montre ta maturité.</w:t>
+              <w:t xml:space="preserve">5:25-6:40</w:t>
+            </w:r>
+          </w:p>
+        </w:tc>
+        <w:tc>
+          <w:tcPr/>
+          <w:p>
+            <w:pPr>
+              <w:pStyle w:val="Compact"/>
+            </w:pPr>
+            <w:r>
+              <w:t xml:space="preserve">10. Comparaison des 12 modèles</w:t>
+            </w:r>
+          </w:p>
+        </w:tc>
+        <w:tc>
+          <w:tcPr/>
+          <w:p>
+            <w:pPr>
+              <w:pStyle w:val="Compact"/>
+            </w:pPr>
+            <w:r>
+              <w:t xml:space="preserve">LA slide la plus importante. Dis :</w:t>
             </w:r>
             <w:r>
               <w:t xml:space="preserve"> </w:t>
             </w:r>
             <w:r>
-              <w:t xml:space="preserve">“Le R² de 0,45 s’explique par l’absence de photos et de texte dans les données.”</w:t>
+              <w:t xml:space="preserve">“j’ai testé 12 algorithmes avec un protocole identique. Les 3 meilleurs sont tous des méthodes à base d’arbres combinés (les 3 barres coral), loin devant les modèles linéaires (à droite).”</w:t>
+            </w:r>
+            <w:r>
+              <w:t xml:space="preserve"> </w:t>
+            </w:r>
+            <w:r>
+              <w:t xml:space="preserve">Explique en 1 phrase pourquoi (interactions non-linéaires, section 2.5).</w:t>
             </w:r>
           </w:p>
         </w:tc>
@@ -5328,29 +5682,41 @@
               <w:pStyle w:val="Compact"/>
             </w:pPr>
             <w:r>
-              <w:t xml:space="preserve">8:30-9:45</w:t>
-            </w:r>
-          </w:p>
-        </w:tc>
-        <w:tc>
-          <w:tcPr/>
-          <w:p>
-            <w:pPr>
-              <w:pStyle w:val="Compact"/>
-            </w:pPr>
-            <w:r>
-              <w:t xml:space="preserve">12. Démo application</w:t>
-            </w:r>
-          </w:p>
-        </w:tc>
-        <w:tc>
-          <w:tcPr/>
-          <w:p>
-            <w:pPr>
-              <w:pStyle w:val="Compact"/>
-            </w:pPr>
-            <w:r>
-              <w:t xml:space="preserve">Si possible, fais une VRAIE démo live plutôt que juste montrer la slide (bien plus impressionnant). Sinon, présente les 3 onglets et l’exemple de prédiction (166$ vs 87$ de moyenne).</w:t>
+              <w:t xml:space="preserve">6:40-7:40</w:t>
+            </w:r>
+          </w:p>
+        </w:tc>
+        <w:tc>
+          <w:tcPr/>
+          <w:p>
+            <w:pPr>
+              <w:pStyle w:val="Compact"/>
+            </w:pPr>
+            <w:r>
+              <w:t xml:space="preserve">11. Modèle final XGBoost</w:t>
+            </w:r>
+          </w:p>
+        </w:tc>
+        <w:tc>
+          <w:tcPr/>
+          <w:p>
+            <w:pPr>
+              <w:pStyle w:val="Compact"/>
+            </w:pPr>
+            <w:r>
+              <w:t xml:space="preserve">Donne les 4 métriques en les traduisant :</w:t>
+            </w:r>
+            <w:r>
+              <w:t xml:space="preserve"> </w:t>
+            </w:r>
+            <w:r>
+              <w:t xml:space="preserve">“mon modèle se trompe en moyenne de 48$ par nuit, et explique 45% de la variation du prix.”</w:t>
+            </w:r>
+            <w:r>
+              <w:t xml:space="preserve"> </w:t>
+            </w:r>
+            <w:r>
+              <w:t xml:space="preserve">Mentionne le résultat de feature importance (logement entier = 59% du poids).</w:t>
             </w:r>
           </w:p>
         </w:tc>
@@ -5363,29 +5729,35 @@
               <w:pStyle w:val="Compact"/>
             </w:pPr>
             <w:r>
-              <w:t xml:space="preserve">9:45-10:30</w:t>
-            </w:r>
-          </w:p>
-        </w:tc>
-        <w:tc>
-          <w:tcPr/>
-          <w:p>
-            <w:pPr>
-              <w:pStyle w:val="Compact"/>
-            </w:pPr>
-            <w:r>
-              <w:t xml:space="preserve">13. Difficultés</w:t>
-            </w:r>
-          </w:p>
-        </w:tc>
-        <w:tc>
-          <w:tcPr/>
-          <w:p>
-            <w:pPr>
-              <w:pStyle w:val="Compact"/>
-            </w:pPr>
-            <w:r>
-              <w:t xml:space="preserve">Choisis 2-3 difficultés max à raconter à l’oral (SVR trop lent, bug d’import corrigé), le reste sert pour les questions.</w:t>
+              <w:t xml:space="preserve">7:40-8:20</w:t>
+            </w:r>
+          </w:p>
+        </w:tc>
+        <w:tc>
+          <w:tcPr/>
+          <w:p>
+            <w:pPr>
+              <w:pStyle w:val="Compact"/>
+            </w:pPr>
+            <w:r>
+              <w:t xml:space="preserve">12. Analyse critique</w:t>
+            </w:r>
+          </w:p>
+        </w:tc>
+        <w:tc>
+          <w:tcPr/>
+          <w:p>
+            <w:pPr>
+              <w:pStyle w:val="Compact"/>
+            </w:pPr>
+            <w:r>
+              <w:t xml:space="preserve">Dis les points forts vite, puis ATTARDE-toi sur les limites — ça montre ta maturité.</w:t>
+            </w:r>
+            <w:r>
+              <w:t xml:space="preserve"> </w:t>
+            </w:r>
+            <w:r>
+              <w:t xml:space="preserve">“Le R² de 0,45 s’explique par l’absence de photos et de texte dans les données.”</w:t>
             </w:r>
           </w:p>
         </w:tc>
@@ -5398,29 +5770,29 @@
               <w:pStyle w:val="Compact"/>
             </w:pPr>
             <w:r>
-              <w:t xml:space="preserve">10:30-11:30</w:t>
-            </w:r>
-          </w:p>
-        </w:tc>
-        <w:tc>
-          <w:tcPr/>
-          <w:p>
-            <w:pPr>
-              <w:pStyle w:val="Compact"/>
-            </w:pPr>
-            <w:r>
-              <w:t xml:space="preserve">14. Conclusion et perspectives</w:t>
-            </w:r>
-          </w:p>
-        </w:tc>
-        <w:tc>
-          <w:tcPr/>
-          <w:p>
-            <w:pPr>
-              <w:pStyle w:val="Compact"/>
-            </w:pPr>
-            <w:r>
-              <w:t xml:space="preserve">Reprends les objectifs atteints, cite 2 perspectives (avis textuels + photos, déploiement cloud).</w:t>
+              <w:t xml:space="preserve">8:20-9:35</w:t>
+            </w:r>
+          </w:p>
+        </w:tc>
+        <w:tc>
+          <w:tcPr/>
+          <w:p>
+            <w:pPr>
+              <w:pStyle w:val="Compact"/>
+            </w:pPr>
+            <w:r>
+              <w:t xml:space="preserve">13. Démo application</w:t>
+            </w:r>
+          </w:p>
+        </w:tc>
+        <w:tc>
+          <w:tcPr/>
+          <w:p>
+            <w:pPr>
+              <w:pStyle w:val="Compact"/>
+            </w:pPr>
+            <w:r>
+              <w:t xml:space="preserve">Si possible, fais une VRAIE démo live plutôt que juste montrer la slide (bien plus impressionnant). Sinon, présente les 3 onglets et l’exemple de prédiction (150$ vs 118$ de moyenne Brooklyn, avec l’arrondissement déduit automatiquement du clic sur la carte).</w:t>
             </w:r>
           </w:p>
         </w:tc>
@@ -5433,18 +5805,88 @@
               <w:pStyle w:val="Compact"/>
             </w:pPr>
             <w:r>
-              <w:t xml:space="preserve">11:30-12:00</w:t>
-            </w:r>
-          </w:p>
-        </w:tc>
-        <w:tc>
-          <w:tcPr/>
-          <w:p>
-            <w:pPr>
-              <w:pStyle w:val="Compact"/>
-            </w:pPr>
-            <w:r>
-              <w:t xml:space="preserve">15. Merci</w:t>
+              <w:t xml:space="preserve">9:35-10:05</w:t>
+            </w:r>
+          </w:p>
+        </w:tc>
+        <w:tc>
+          <w:tcPr/>
+          <w:p>
+            <w:pPr>
+              <w:pStyle w:val="Compact"/>
+            </w:pPr>
+            <w:r>
+              <w:t xml:space="preserve">14. Difficultés</w:t>
+            </w:r>
+          </w:p>
+        </w:tc>
+        <w:tc>
+          <w:tcPr/>
+          <w:p>
+            <w:pPr>
+              <w:pStyle w:val="Compact"/>
+            </w:pPr>
+            <w:r>
+              <w:t xml:space="preserve">Choisis 2-3 difficultés max à raconter à l’oral (SVR trop lent, bug d’import corrigé), le reste sert pour les questions.</w:t>
+            </w:r>
+          </w:p>
+        </w:tc>
+      </w:tr>
+      <w:tr>
+        <w:tc>
+          <w:tcPr/>
+          <w:p>
+            <w:pPr>
+              <w:pStyle w:val="Compact"/>
+            </w:pPr>
+            <w:r>
+              <w:t xml:space="preserve">10:05-11:00</w:t>
+            </w:r>
+          </w:p>
+        </w:tc>
+        <w:tc>
+          <w:tcPr/>
+          <w:p>
+            <w:pPr>
+              <w:pStyle w:val="Compact"/>
+            </w:pPr>
+            <w:r>
+              <w:t xml:space="preserve">15. Conclusion et perspectives</w:t>
+            </w:r>
+          </w:p>
+        </w:tc>
+        <w:tc>
+          <w:tcPr/>
+          <w:p>
+            <w:pPr>
+              <w:pStyle w:val="Compact"/>
+            </w:pPr>
+            <w:r>
+              <w:t xml:space="preserve">Reprends les objectifs atteints, cite 2 perspectives (avis textuels + photos, déploiement cloud).</w:t>
+            </w:r>
+          </w:p>
+        </w:tc>
+      </w:tr>
+      <w:tr>
+        <w:tc>
+          <w:tcPr/>
+          <w:p>
+            <w:pPr>
+              <w:pStyle w:val="Compact"/>
+            </w:pPr>
+            <w:r>
+              <w:t xml:space="preserve">11:00-11:20</w:t>
+            </w:r>
+          </w:p>
+        </w:tc>
+        <w:tc>
+          <w:tcPr/>
+          <w:p>
+            <w:pPr>
+              <w:pStyle w:val="Compact"/>
+            </w:pPr>
+            <w:r>
+              <w:t xml:space="preserve">16. Merci</w:t>
             </w:r>
           </w:p>
         </w:tc>
@@ -5486,8 +5928,8 @@
         </w:pict>
       </w:r>
     </w:p>
-    <w:bookmarkEnd w:id="42"/>
-    <w:bookmarkStart w:id="49" w:name="Xe981fecffa18ab5d191998683ecf183809333ba"/>
+    <w:bookmarkEnd w:id="43"/>
+    <w:bookmarkStart w:id="50" w:name="Xe981fecffa18ab5d191998683ecf183809333ba"/>
     <w:p>
       <w:pPr>
         <w:pStyle w:val="Heading1"/>
@@ -5496,7 +5938,7 @@
         <w:t xml:space="preserve">PARTIE 5 — Questions du jury, préparées en détail</w:t>
       </w:r>
     </w:p>
-    <w:bookmarkStart w:id="43" w:name="sur-la-méthodologie-générale"/>
+    <w:bookmarkStart w:id="44" w:name="sur-la-méthodologie-générale"/>
     <w:p>
       <w:pPr>
         <w:pStyle w:val="Heading2"/>
@@ -5586,8 +6028,8 @@
         <w:t xml:space="preserve">&gt; C’est un enchaînement automatique d’étapes (le prétraitement puis le modèle) regroupées en un seul objet. Ça garantit que exactement les mêmes transformations (standardisation, encodage) sont appliquées à l’entraînement ET à la prédiction, ce qui évite les erreurs et rend le code plus propre et réutilisable dans l’application.</w:t>
       </w:r>
     </w:p>
-    <w:bookmarkEnd w:id="43"/>
-    <w:bookmarkStart w:id="44" w:name="sur-le-prétraitement"/>
+    <w:bookmarkEnd w:id="44"/>
+    <w:bookmarkStart w:id="45" w:name="sur-le-prétraitement"/>
     <w:p>
       <w:pPr>
         <w:pStyle w:val="Heading2"/>
@@ -5689,8 +6131,8 @@
         <w:t xml:space="preserve">dans les features. Une version plus avancée utiliserait le prix moyen par quartier (target encoding), mais cela demande une validation croisée imbriquée pour éviter une fuite de données ; je l’ai identifié comme piste d’amélioration plutôt que de le faire à la légère.</w:t>
       </w:r>
     </w:p>
-    <w:bookmarkEnd w:id="44"/>
-    <w:bookmarkStart w:id="45" w:name="sur-les-modèles"/>
+    <w:bookmarkEnd w:id="45"/>
+    <w:bookmarkStart w:id="46" w:name="sur-les-modèles"/>
     <w:p>
       <w:pPr>
         <w:pStyle w:val="Heading2"/>
@@ -5849,8 +6291,8 @@
         <w:t xml:space="preserve">&gt; Un seul découpage peut être favorisé ou défavorisé par le hasard. La validation croisée répète l’entraînement et l’évaluation 5 fois sur des découpages différents et moyenne les résultats, ce qui donne une estimation plus stable et fiable de la performance réelle.</w:t>
       </w:r>
     </w:p>
-    <w:bookmarkEnd w:id="45"/>
-    <w:bookmarkStart w:id="46" w:name="X521a89ac0359dff0e3e4a99b1f8efa01a8b8d9e"/>
+    <w:bookmarkEnd w:id="46"/>
+    <w:bookmarkStart w:id="47" w:name="X521a89ac0359dff0e3e4a99b1f8efa01a8b8d9e"/>
     <w:p>
       <w:pPr>
         <w:pStyle w:val="Heading2"/>
@@ -5931,8 +6373,8 @@
         <w:t xml:space="preserve">&gt; Je testerais probablement d’entraîner sur log(prix) plutôt que le prix brut pour stabiliser la variance des résidus, et j’essaierais un target encoding plus sophistiqué pour le quartier dès le départ plutôt que l’encodage par fréquence.</w:t>
       </w:r>
     </w:p>
-    <w:bookmarkEnd w:id="46"/>
-    <w:bookmarkStart w:id="47" w:name="sur-lapplication"/>
+    <w:bookmarkEnd w:id="47"/>
+    <w:bookmarkStart w:id="48" w:name="sur-lapplication"/>
     <w:p>
       <w:pPr>
         <w:pStyle w:val="Heading2"/>
@@ -6040,8 +6482,8 @@
         <w:t xml:space="preserve">de Streamlit. Rien n’est sauvegardé de façon persistante entre deux sessions différentes — ce serait nécessaire pour un usage en production, mais hors du périmètre pédagogique de ce projet.</w:t>
       </w:r>
     </w:p>
-    <w:bookmarkEnd w:id="47"/>
-    <w:bookmarkStart w:id="48" w:name="X2e95315dcecad812443f16f3bbc92b3858ba62c"/>
+    <w:bookmarkEnd w:id="48"/>
+    <w:bookmarkStart w:id="49" w:name="X2e95315dcecad812443f16f3bbc92b3858ba62c"/>
     <w:p>
       <w:pPr>
         <w:pStyle w:val="Heading2"/>
@@ -6132,9 +6574,9 @@
         </w:pict>
       </w:r>
     </w:p>
-    <w:bookmarkEnd w:id="48"/>
     <w:bookmarkEnd w:id="49"/>
-    <w:bookmarkStart w:id="50" w:name="partie-6-conseils-pour-le-jour-j"/>
+    <w:bookmarkEnd w:id="50"/>
+    <w:bookmarkStart w:id="51" w:name="partie-6-conseils-pour-le-jour-j"/>
     <w:p>
       <w:pPr>
         <w:pStyle w:val="Heading1"/>
@@ -6296,7 +6738,7 @@
         <w:t xml:space="preserve">Relis ce guide une dernière fois la veille au soir, pas le matin même — pour arriver reposée plutôt que sur-stressée à essayer de tout mémoriser en dernière minute.</w:t>
       </w:r>
     </w:p>
-    <w:bookmarkEnd w:id="50"/>
+    <w:bookmarkEnd w:id="51"/>
     <w:sectPr>
       <w:footnotePr>
         <w:numRestart w:val="eachSect"/>

</xml_diff>